<commit_message>
Prepare v0.1.0 application note release
</commit_message>
<xml_diff>
--- a/manuscript/bioinformatics_application_note_submission_20260619/Bioinformatics_Application_Note_cfRNA_BrainTrace_submission_final_candidate.docx
+++ b/manuscript/bioinformatics_application_note_submission_20260619/Bioinformatics_Application_Note_cfRNA_BrainTrace_submission_final_candidate.docx
@@ -168,7 +168,7 @@
           <w:rFonts w:ascii="Arial" w:hAnsi="Arial" w:eastAsia="Arial"/>
           <w:sz w:val="19"/>
         </w:rPr>
-        <w:t xml:space="preserve">. The manuscript release must be archived before submission at </w:t>
+        <w:t xml:space="preserve">. The manuscript release is archived at </w:t>
       </w:r>
       <w:r>
         <w:rPr>
@@ -176,7 +176,7 @@
           <w:b/>
           <w:sz w:val="19"/>
         </w:rPr>
-        <w:t>[ZENODO DOI REQUIRED BEFORE SUBMISSION]</w:t>
+        <w:t>https://doi.org/10.5281/zenodo.20773675</w:t>
       </w:r>
       <w:r>
         <w:rPr>
@@ -698,7 +698,7 @@
           <w:rFonts w:ascii="Arial" w:hAnsi="Arial" w:eastAsia="Arial"/>
           <w:sz w:val="19"/>
         </w:rPr>
-        <w:t xml:space="preserve">The Bo2023 macaque transcriptomic atlas, Allen Human Brain Atlas, TCGA/BraTS and GEO datasets are available from their original repositories under their original access conditions. Repository scripts and local supplementary tables document the analyses reported here. Processed non-sensitive evaluation tables and figure source data require public archival DOI before submission at </w:t>
+        <w:t xml:space="preserve">The Bo2023 macaque transcriptomic atlas, Allen Human Brain Atlas, TCGA/BraTS and GEO datasets are available from their original repositories under their original access conditions. Repository scripts, processed non-sensitive evaluation tables and figure source data are archived with the release at </w:t>
       </w:r>
       <w:r>
         <w:rPr>
@@ -706,7 +706,7 @@
           <w:b/>
           <w:sz w:val="19"/>
         </w:rPr>
-        <w:t>[DOI REQUIRED BEFORE SUBMISSION]</w:t>
+        <w:t>https://doi.org/10.5281/zenodo.20773675</w:t>
       </w:r>
       <w:r>
         <w:rPr>

</xml_diff>